<commit_message>
Organize labs into independent task directories and update reports
</commit_message>
<xml_diff>
--- a/Отчёты/Лаб1_Колесников_8В31_Параллельные_вычисления_1.docx
+++ b/Отчёты/Лаб1_Колесников_8В31_Параллельные_вычисления_1.docx
@@ -7,7 +7,9 @@
         <w:pStyle w:val="Normal1"/>
         <w:shd w:val="clear" w:color="auto" w:fill="FFFFFF"/>
         <w:spacing w:after="0"/>
-      </w:pPr>
+        <w:jc w:val="center"/>
+      </w:pPr>
+      <w:bookmarkStart w:id="0" w:name="_Hlk241665711"/>
       <w:r>
         <w:rPr>
           <w:rFonts w:ascii="Times New Roman" w:eastAsia="Times New Roman" w:hAnsi="Times New Roman"/>
@@ -496,6 +498,7 @@
         <w:t>А.С. Юдин</w:t>
       </w:r>
     </w:p>
+    <w:bookmarkEnd w:id="0"/>
     <w:p/>
     <w:p>
       <w:pPr>
@@ -4929,6 +4932,7 @@
         </w:rPr>
         <w:t>2.</w:t>
       </w:r>
+      <w:proofErr w:type="spellStart"/>
       <w:r>
         <w:rPr>
           <w:rFonts w:ascii="Consolas" w:eastAsia="Consolas" w:hAnsi="Consolas" w:cs="Consolas"/>
@@ -4938,6 +4942,7 @@
         </w:rPr>
         <w:t>cpp</w:t>
       </w:r>
+      <w:proofErr w:type="spellEnd"/>
       <w:r>
         <w:rPr>
           <w:rFonts w:ascii="Consolas" w:eastAsia="Consolas" w:hAnsi="Consolas" w:cs="Consolas"/>
@@ -4963,7 +4968,6 @@
         </w:rPr>
         <w:t>=</w:t>
       </w:r>
-      <w:proofErr w:type="spellStart"/>
       <w:r>
         <w:rPr>
           <w:rFonts w:ascii="Consolas" w:eastAsia="Consolas" w:hAnsi="Consolas" w:cs="Consolas"/>
@@ -4973,7 +4977,6 @@
         </w:rPr>
         <w:t>c</w:t>
       </w:r>
-      <w:proofErr w:type="spellEnd"/>
       <w:r>
         <w:rPr>
           <w:rFonts w:ascii="Consolas" w:eastAsia="Consolas" w:hAnsi="Consolas" w:cs="Consolas"/>
@@ -14931,7 +14934,6 @@
         </w:rPr>
         <w:t>2.</w:t>
       </w:r>
-      <w:proofErr w:type="spellStart"/>
       <w:r>
         <w:rPr>
           <w:b/>
@@ -14940,7 +14942,6 @@
         </w:rPr>
         <w:t>cpp</w:t>
       </w:r>
-      <w:proofErr w:type="spellEnd"/>
       <w:r>
         <w:rPr>
           <w:b/>

</xml_diff>